<commit_message>
Refine survey v3: verified Busan Bank app features, account channel item, team review memo
Replace Busan Bank app feature options with ones confirmed from public sources (2024 app redesign, Life menu, Dongbaekjeon, youth products), add the account-task channel question required by the guide, reword the regional service demand item, restore the submission header format, and add a team review memo with sources and a requirement checklist.

Co-Authored-By: Claude Fable 5.1 <noreply@anthropic.com>
Claude-Session: https://claude.ai/code/session_01VmA2XxoA9Sd3XarQPRzJvq
</commit_message>
<xml_diff>
--- a/survey/부산은행_모바일뱅킹_설문지_v3.docx
+++ b/survey/부산은행_모바일뱅킹_설문지_v3.docx
@@ -62,7 +62,7 @@
           <w:sz w:val="20"/>
           <w:szCs w:val="20"/>
         </w:rPr>
-        <w:t xml:space="preserve">글로벌시장조사론 1조 · 정시윤 · 마가심 · 이수연 · 안명기</w:t>
+        <w:t xml:space="preserve">글로벌시장조사론 1조 | 팀장 이메일: leesooyeon1337@naver.com | 참여팀원: 이수연(팀장) · 안명기 · 마가심 · 정시윤</w:t>
       </w:r>
     </w:p>
     <w:p>
@@ -1868,7 +1868,7 @@
                 <w:sz w:val="18"/>
                 <w:szCs w:val="18"/>
               </w:rPr>
-              <w:t xml:space="preserve">4) 주 이용 앱 변경과 전환: 변경 경험·계기, 부산은행 계좌의 타 앱 이용</w:t>
+              <w:t xml:space="preserve">4) 주 이용 앱 변경과 전환: 변경 경험·계기, 부산은행 계좌 업무 처리 경로</w:t>
             </w:r>
           </w:p>
         </w:tc>
@@ -12443,7 +12443,7 @@
           <w:sz w:val="20"/>
           <w:szCs w:val="20"/>
         </w:rPr>
-        <w:t xml:space="preserve">부산은행 모바일뱅킹에서 제공한다고 알고 있는 기능·서비스를 3가지만 골라 번호를 적어 주세요(이용 여부와 관계없이 알고 있는 것 기준이며, 3가지 미만이면 남은 칸에 ⑪을 적어 주세요).</w:t>
+        <w:t xml:space="preserve">부산은행 모바일뱅킹에서 제공한다고 알고 있는 기능·서비스를 3가지만 골라 번호를 적어 주세요(이용 여부와 관계없이 알고 있는 것 기준이며, 3가지 미만이면 남은 칸에 ⑫를 적어 주세요).</w:t>
       </w:r>
     </w:p>
     <w:tbl>
@@ -12459,9 +12459,8 @@
         </w:tblBorders>
       </w:tblPr>
       <w:tblGrid>
-        <w:gridCol w:w="3213"/>
-        <w:gridCol w:w="3213"/>
-        <w:gridCol w:w="3214"/>
+        <w:gridCol w:w="4820"/>
+        <w:gridCol w:w="4820"/>
       </w:tblGrid>
       <w:tr>
         <w:trPr>
@@ -12469,43 +12468,43 @@
         </w:trPr>
         <w:tc>
           <w:tcPr>
-            <w:tcW w:type="dxa" w:w="3213"/>
-            <w:tcBorders>
-              <w:top w:val="none" w:color="FFFFFF" w:sz="0"/>
-              <w:left w:val="none" w:color="FFFFFF" w:sz="0"/>
-              <w:bottom w:val="none" w:color="FFFFFF" w:sz="0"/>
-              <w:right w:val="none" w:color="FFFFFF" w:sz="0"/>
-            </w:tcBorders>
-            <w:tcMar>
-              <w:top w:type="dxa" w:w="25"/>
-              <w:left w:type="dxa" w:w="70"/>
-              <w:bottom w:type="dxa" w:w="25"/>
-              <w:right w:type="dxa" w:w="70"/>
-            </w:tcMar>
-          </w:tcPr>
-          <w:p>
-            <w:pPr>
-              <w:keepNext/>
-              <w:keepLines/>
-              <w:spacing w:after="0" w:before="0" w:line="276"/>
-            </w:pPr>
-            <w:r>
-              <w:rPr>
-                <w:rFonts w:ascii="맑은 고딕" w:cs="맑은 고딕" w:eastAsia="맑은 고딕" w:hAnsi="맑은 고딕"/>
-                <w:b w:val="false"/>
-                <w:bCs w:val="false"/>
-                <w:i w:val="false"/>
-                <w:iCs w:val="false"/>
-                <w:sz w:val="20"/>
-                <w:szCs w:val="20"/>
-              </w:rPr>
-              <w:t xml:space="preserve">① 계좌 조회·이체</w:t>
-            </w:r>
-          </w:p>
-        </w:tc>
-        <w:tc>
-          <w:tcPr>
-            <w:tcW w:type="dxa" w:w="3213"/>
+            <w:tcW w:type="dxa" w:w="4820"/>
+            <w:tcBorders>
+              <w:top w:val="none" w:color="FFFFFF" w:sz="0"/>
+              <w:left w:val="none" w:color="FFFFFF" w:sz="0"/>
+              <w:bottom w:val="none" w:color="FFFFFF" w:sz="0"/>
+              <w:right w:val="none" w:color="FFFFFF" w:sz="0"/>
+            </w:tcBorders>
+            <w:tcMar>
+              <w:top w:type="dxa" w:w="25"/>
+              <w:left w:type="dxa" w:w="70"/>
+              <w:bottom w:type="dxa" w:w="25"/>
+              <w:right w:type="dxa" w:w="70"/>
+            </w:tcMar>
+          </w:tcPr>
+          <w:p>
+            <w:pPr>
+              <w:keepNext/>
+              <w:keepLines/>
+              <w:spacing w:after="0" w:before="0" w:line="276"/>
+            </w:pPr>
+            <w:r>
+              <w:rPr>
+                <w:rFonts w:ascii="맑은 고딕" w:cs="맑은 고딕" w:eastAsia="맑은 고딕" w:hAnsi="맑은 고딕"/>
+                <w:b w:val="false"/>
+                <w:bCs w:val="false"/>
+                <w:i w:val="false"/>
+                <w:iCs w:val="false"/>
+                <w:sz w:val="20"/>
+                <w:szCs w:val="20"/>
+              </w:rPr>
+              <w:t xml:space="preserve">① 계좌 조회·이체(연락처 송금·클립송금 포함)</w:t>
+            </w:r>
+          </w:p>
+        </w:tc>
+        <w:tc>
+          <w:tcPr>
+            <w:tcW w:type="dxa" w:w="4820"/>
             <w:tcBorders>
               <w:top w:val="none" w:color="FFFFFF" w:sz="0"/>
               <w:left w:val="none" w:color="FFFFFF" w:sz="0"/>
@@ -12536,42 +12535,6 @@
                 <w:szCs w:val="20"/>
               </w:rPr>
               <w:t xml:space="preserve">② 예금·적금·대출 상품 가입</w:t>
-            </w:r>
-          </w:p>
-        </w:tc>
-        <w:tc>
-          <w:tcPr>
-            <w:tcW w:type="dxa" w:w="3214"/>
-            <w:tcBorders>
-              <w:top w:val="none" w:color="FFFFFF" w:sz="0"/>
-              <w:left w:val="none" w:color="FFFFFF" w:sz="0"/>
-              <w:bottom w:val="none" w:color="FFFFFF" w:sz="0"/>
-              <w:right w:val="none" w:color="FFFFFF" w:sz="0"/>
-            </w:tcBorders>
-            <w:tcMar>
-              <w:top w:type="dxa" w:w="25"/>
-              <w:left w:type="dxa" w:w="70"/>
-              <w:bottom w:type="dxa" w:w="25"/>
-              <w:right w:type="dxa" w:w="70"/>
-            </w:tcMar>
-          </w:tcPr>
-          <w:p>
-            <w:pPr>
-              <w:keepNext/>
-              <w:keepLines/>
-              <w:spacing w:after="0" w:before="0" w:line="276"/>
-            </w:pPr>
-            <w:r>
-              <w:rPr>
-                <w:rFonts w:ascii="맑은 고딕" w:cs="맑은 고딕" w:eastAsia="맑은 고딕" w:hAnsi="맑은 고딕"/>
-                <w:b w:val="false"/>
-                <w:bCs w:val="false"/>
-                <w:i w:val="false"/>
-                <w:iCs w:val="false"/>
-                <w:sz w:val="20"/>
-                <w:szCs w:val="20"/>
-              </w:rPr>
-              <w:t xml:space="preserve">③ 환전·외화</w:t>
             </w:r>
           </w:p>
         </w:tc>
@@ -12582,7 +12545,43 @@
         </w:trPr>
         <w:tc>
           <w:tcPr>
-            <w:tcW w:type="dxa" w:w="3213"/>
+            <w:tcW w:type="dxa" w:w="4820"/>
+            <w:tcBorders>
+              <w:top w:val="none" w:color="FFFFFF" w:sz="0"/>
+              <w:left w:val="none" w:color="FFFFFF" w:sz="0"/>
+              <w:bottom w:val="none" w:color="FFFFFF" w:sz="0"/>
+              <w:right w:val="none" w:color="FFFFFF" w:sz="0"/>
+            </w:tcBorders>
+            <w:tcMar>
+              <w:top w:type="dxa" w:w="25"/>
+              <w:left w:type="dxa" w:w="70"/>
+              <w:bottom w:type="dxa" w:w="25"/>
+              <w:right w:type="dxa" w:w="70"/>
+            </w:tcMar>
+          </w:tcPr>
+          <w:p>
+            <w:pPr>
+              <w:keepNext/>
+              <w:keepLines/>
+              <w:spacing w:after="0" w:before="0" w:line="276"/>
+            </w:pPr>
+            <w:r>
+              <w:rPr>
+                <w:rFonts w:ascii="맑은 고딕" w:cs="맑은 고딕" w:eastAsia="맑은 고딕" w:hAnsi="맑은 고딕"/>
+                <w:b w:val="false"/>
+                <w:bCs w:val="false"/>
+                <w:i w:val="false"/>
+                <w:iCs w:val="false"/>
+                <w:sz w:val="20"/>
+                <w:szCs w:val="20"/>
+              </w:rPr>
+              <w:t xml:space="preserve">③ 지문·패턴·간편비밀번호 간편 로그인</w:t>
+            </w:r>
+          </w:p>
+        </w:tc>
+        <w:tc>
+          <w:tcPr>
+            <w:tcW w:type="dxa" w:w="4820"/>
             <w:tcBorders>
               <w:top w:val="none" w:color="FFFFFF" w:sz="0"/>
               <w:left w:val="none" w:color="FFFFFF" w:sz="0"/>
@@ -12613,78 +12612,6 @@
                 <w:szCs w:val="20"/>
               </w:rPr>
               <w:t xml:space="preserve">④ 공과금·지방세 납부</w:t>
-            </w:r>
-          </w:p>
-        </w:tc>
-        <w:tc>
-          <w:tcPr>
-            <w:tcW w:type="dxa" w:w="3213"/>
-            <w:tcBorders>
-              <w:top w:val="none" w:color="FFFFFF" w:sz="0"/>
-              <w:left w:val="none" w:color="FFFFFF" w:sz="0"/>
-              <w:bottom w:val="none" w:color="FFFFFF" w:sz="0"/>
-              <w:right w:val="none" w:color="FFFFFF" w:sz="0"/>
-            </w:tcBorders>
-            <w:tcMar>
-              <w:top w:type="dxa" w:w="25"/>
-              <w:left w:type="dxa" w:w="70"/>
-              <w:bottom w:type="dxa" w:w="25"/>
-              <w:right w:type="dxa" w:w="70"/>
-            </w:tcMar>
-          </w:tcPr>
-          <w:p>
-            <w:pPr>
-              <w:keepNext/>
-              <w:keepLines/>
-              <w:spacing w:after="0" w:before="0" w:line="276"/>
-            </w:pPr>
-            <w:r>
-              <w:rPr>
-                <w:rFonts w:ascii="맑은 고딕" w:cs="맑은 고딕" w:eastAsia="맑은 고딕" w:hAnsi="맑은 고딕"/>
-                <w:b w:val="false"/>
-                <w:bCs w:val="false"/>
-                <w:i w:val="false"/>
-                <w:iCs w:val="false"/>
-                <w:sz w:val="20"/>
-                <w:szCs w:val="20"/>
-              </w:rPr>
-              <w:t xml:space="preserve">⑤ 동백전 등 부산 지역화폐·지역 혜택 연계</w:t>
-            </w:r>
-          </w:p>
-        </w:tc>
-        <w:tc>
-          <w:tcPr>
-            <w:tcW w:type="dxa" w:w="3214"/>
-            <w:tcBorders>
-              <w:top w:val="none" w:color="FFFFFF" w:sz="0"/>
-              <w:left w:val="none" w:color="FFFFFF" w:sz="0"/>
-              <w:bottom w:val="none" w:color="FFFFFF" w:sz="0"/>
-              <w:right w:val="none" w:color="FFFFFF" w:sz="0"/>
-            </w:tcBorders>
-            <w:tcMar>
-              <w:top w:type="dxa" w:w="25"/>
-              <w:left w:type="dxa" w:w="70"/>
-              <w:bottom w:type="dxa" w:w="25"/>
-              <w:right w:type="dxa" w:w="70"/>
-            </w:tcMar>
-          </w:tcPr>
-          <w:p>
-            <w:pPr>
-              <w:keepNext/>
-              <w:keepLines/>
-              <w:spacing w:after="0" w:before="0" w:line="276"/>
-            </w:pPr>
-            <w:r>
-              <w:rPr>
-                <w:rFonts w:ascii="맑은 고딕" w:cs="맑은 고딕" w:eastAsia="맑은 고딕" w:hAnsi="맑은 고딕"/>
-                <w:b w:val="false"/>
-                <w:bCs w:val="false"/>
-                <w:i w:val="false"/>
-                <w:iCs w:val="false"/>
-                <w:sz w:val="20"/>
-                <w:szCs w:val="20"/>
-              </w:rPr>
-              <w:t xml:space="preserve">⑥ 제휴 할인·적립 혜택</w:t>
             </w:r>
           </w:p>
         </w:tc>
@@ -12695,109 +12622,73 @@
         </w:trPr>
         <w:tc>
           <w:tcPr>
-            <w:tcW w:type="dxa" w:w="3213"/>
-            <w:tcBorders>
-              <w:top w:val="none" w:color="FFFFFF" w:sz="0"/>
-              <w:left w:val="none" w:color="FFFFFF" w:sz="0"/>
-              <w:bottom w:val="none" w:color="FFFFFF" w:sz="0"/>
-              <w:right w:val="none" w:color="FFFFFF" w:sz="0"/>
-            </w:tcBorders>
-            <w:tcMar>
-              <w:top w:type="dxa" w:w="25"/>
-              <w:left w:type="dxa" w:w="70"/>
-              <w:bottom w:type="dxa" w:w="25"/>
-              <w:right w:type="dxa" w:w="70"/>
-            </w:tcMar>
-          </w:tcPr>
-          <w:p>
-            <w:pPr>
-              <w:keepNext/>
-              <w:keepLines/>
-              <w:spacing w:after="0" w:before="0" w:line="276"/>
-            </w:pPr>
-            <w:r>
-              <w:rPr>
-                <w:rFonts w:ascii="맑은 고딕" w:cs="맑은 고딕" w:eastAsia="맑은 고딕" w:hAnsi="맑은 고딕"/>
-                <w:b w:val="false"/>
-                <w:bCs w:val="false"/>
-                <w:i w:val="false"/>
-                <w:iCs w:val="false"/>
-                <w:sz w:val="20"/>
-                <w:szCs w:val="20"/>
-              </w:rPr>
-              <w:t xml:space="preserve">⑦ 청년·대학생 전용 상품·혜택</w:t>
-            </w:r>
-          </w:p>
-        </w:tc>
-        <w:tc>
-          <w:tcPr>
-            <w:tcW w:type="dxa" w:w="3213"/>
-            <w:tcBorders>
-              <w:top w:val="none" w:color="FFFFFF" w:sz="0"/>
-              <w:left w:val="none" w:color="FFFFFF" w:sz="0"/>
-              <w:bottom w:val="none" w:color="FFFFFF" w:sz="0"/>
-              <w:right w:val="none" w:color="FFFFFF" w:sz="0"/>
-            </w:tcBorders>
-            <w:tcMar>
-              <w:top w:type="dxa" w:w="25"/>
-              <w:left w:type="dxa" w:w="70"/>
-              <w:bottom w:type="dxa" w:w="25"/>
-              <w:right w:type="dxa" w:w="70"/>
-            </w:tcMar>
-          </w:tcPr>
-          <w:p>
-            <w:pPr>
-              <w:keepNext/>
-              <w:keepLines/>
-              <w:spacing w:after="0" w:before="0" w:line="276"/>
-            </w:pPr>
-            <w:r>
-              <w:rPr>
-                <w:rFonts w:ascii="맑은 고딕" w:cs="맑은 고딕" w:eastAsia="맑은 고딕" w:hAnsi="맑은 고딕"/>
-                <w:b w:val="false"/>
-                <w:bCs w:val="false"/>
-                <w:i w:val="false"/>
-                <w:iCs w:val="false"/>
-                <w:sz w:val="20"/>
-                <w:szCs w:val="20"/>
-              </w:rPr>
-              <w:t xml:space="preserve">⑧ 자산관리·소비내역 분석</w:t>
-            </w:r>
-          </w:p>
-        </w:tc>
-        <w:tc>
-          <w:tcPr>
-            <w:tcW w:type="dxa" w:w="3214"/>
-            <w:tcBorders>
-              <w:top w:val="none" w:color="FFFFFF" w:sz="0"/>
-              <w:left w:val="none" w:color="FFFFFF" w:sz="0"/>
-              <w:bottom w:val="none" w:color="FFFFFF" w:sz="0"/>
-              <w:right w:val="none" w:color="FFFFFF" w:sz="0"/>
-            </w:tcBorders>
-            <w:tcMar>
-              <w:top w:type="dxa" w:w="25"/>
-              <w:left w:type="dxa" w:w="70"/>
-              <w:bottom w:type="dxa" w:w="25"/>
-              <w:right w:type="dxa" w:w="70"/>
-            </w:tcMar>
-          </w:tcPr>
-          <w:p>
-            <w:pPr>
-              <w:keepNext/>
-              <w:keepLines/>
-              <w:spacing w:after="0" w:before="0" w:line="276"/>
-            </w:pPr>
-            <w:r>
-              <w:rPr>
-                <w:rFonts w:ascii="맑은 고딕" w:cs="맑은 고딕" w:eastAsia="맑은 고딕" w:hAnsi="맑은 고딕"/>
-                <w:b w:val="false"/>
-                <w:bCs w:val="false"/>
-                <w:i w:val="false"/>
-                <w:iCs w:val="false"/>
-                <w:sz w:val="20"/>
-                <w:szCs w:val="20"/>
-              </w:rPr>
-              <w:t xml:space="preserve">⑨ 부산 생활정보(행사·관광 등)</w:t>
+            <w:tcW w:type="dxa" w:w="4820"/>
+            <w:tcBorders>
+              <w:top w:val="none" w:color="FFFFFF" w:sz="0"/>
+              <w:left w:val="none" w:color="FFFFFF" w:sz="0"/>
+              <w:bottom w:val="none" w:color="FFFFFF" w:sz="0"/>
+              <w:right w:val="none" w:color="FFFFFF" w:sz="0"/>
+            </w:tcBorders>
+            <w:tcMar>
+              <w:top w:type="dxa" w:w="25"/>
+              <w:left w:type="dxa" w:w="70"/>
+              <w:bottom w:type="dxa" w:w="25"/>
+              <w:right w:type="dxa" w:w="70"/>
+            </w:tcMar>
+          </w:tcPr>
+          <w:p>
+            <w:pPr>
+              <w:keepNext/>
+              <w:keepLines/>
+              <w:spacing w:after="0" w:before="0" w:line="276"/>
+            </w:pPr>
+            <w:r>
+              <w:rPr>
+                <w:rFonts w:ascii="맑은 고딕" w:cs="맑은 고딕" w:eastAsia="맑은 고딕" w:hAnsi="맑은 고딕"/>
+                <w:b w:val="false"/>
+                <w:bCs w:val="false"/>
+                <w:i w:val="false"/>
+                <w:iCs w:val="false"/>
+                <w:sz w:val="20"/>
+                <w:szCs w:val="20"/>
+              </w:rPr>
+              <w:t xml:space="preserve">⑤ 라이프 메뉴의 생활서비스(공연·영화·맛집·여행 예약·할인)</w:t>
+            </w:r>
+          </w:p>
+        </w:tc>
+        <w:tc>
+          <w:tcPr>
+            <w:tcW w:type="dxa" w:w="4820"/>
+            <w:tcBorders>
+              <w:top w:val="none" w:color="FFFFFF" w:sz="0"/>
+              <w:left w:val="none" w:color="FFFFFF" w:sz="0"/>
+              <w:bottom w:val="none" w:color="FFFFFF" w:sz="0"/>
+              <w:right w:val="none" w:color="FFFFFF" w:sz="0"/>
+            </w:tcBorders>
+            <w:tcMar>
+              <w:top w:type="dxa" w:w="25"/>
+              <w:left w:type="dxa" w:w="70"/>
+              <w:bottom w:type="dxa" w:w="25"/>
+              <w:right w:type="dxa" w:w="70"/>
+            </w:tcMar>
+          </w:tcPr>
+          <w:p>
+            <w:pPr>
+              <w:keepNext/>
+              <w:keepLines/>
+              <w:spacing w:after="0" w:before="0" w:line="276"/>
+            </w:pPr>
+            <w:r>
+              <w:rPr>
+                <w:rFonts w:ascii="맑은 고딕" w:cs="맑은 고딕" w:eastAsia="맑은 고딕" w:hAnsi="맑은 고딕"/>
+                <w:b w:val="false"/>
+                <w:bCs w:val="false"/>
+                <w:i w:val="false"/>
+                <w:iCs w:val="false"/>
+                <w:sz w:val="20"/>
+                <w:szCs w:val="20"/>
+              </w:rPr>
+              <w:t xml:space="preserve">⑥ 라이프 스낵365 간식 쇼핑몰</w:t>
             </w:r>
           </w:p>
         </w:tc>
@@ -12808,109 +12699,227 @@
         </w:trPr>
         <w:tc>
           <w:tcPr>
-            <w:tcW w:type="dxa" w:w="3213"/>
-            <w:tcBorders>
-              <w:top w:val="none" w:color="FFFFFF" w:sz="0"/>
-              <w:left w:val="none" w:color="FFFFFF" w:sz="0"/>
-              <w:bottom w:val="none" w:color="FFFFFF" w:sz="0"/>
-              <w:right w:val="none" w:color="FFFFFF" w:sz="0"/>
-            </w:tcBorders>
-            <w:tcMar>
-              <w:top w:type="dxa" w:w="25"/>
-              <w:left w:type="dxa" w:w="70"/>
-              <w:bottom w:type="dxa" w:w="25"/>
-              <w:right w:type="dxa" w:w="70"/>
-            </w:tcMar>
-          </w:tcPr>
-          <w:p>
-            <w:pPr>
-              <w:keepNext/>
-              <w:keepLines/>
-              <w:spacing w:after="0" w:before="0" w:line="276"/>
-            </w:pPr>
-            <w:r>
-              <w:rPr>
-                <w:rFonts w:ascii="맑은 고딕" w:cs="맑은 고딕" w:eastAsia="맑은 고딕" w:hAnsi="맑은 고딕"/>
-                <w:b w:val="false"/>
-                <w:bCs w:val="false"/>
-                <w:i w:val="false"/>
-                <w:iCs w:val="false"/>
-                <w:sz w:val="20"/>
-                <w:szCs w:val="20"/>
-              </w:rPr>
-              <w:t xml:space="preserve">⑩ 기타(          )</w:t>
-            </w:r>
-          </w:p>
-        </w:tc>
-        <w:tc>
-          <w:tcPr>
-            <w:tcW w:type="dxa" w:w="3213"/>
-            <w:tcBorders>
-              <w:top w:val="none" w:color="FFFFFF" w:sz="0"/>
-              <w:left w:val="none" w:color="FFFFFF" w:sz="0"/>
-              <w:bottom w:val="none" w:color="FFFFFF" w:sz="0"/>
-              <w:right w:val="none" w:color="FFFFFF" w:sz="0"/>
-            </w:tcBorders>
-            <w:tcMar>
-              <w:top w:type="dxa" w:w="25"/>
-              <w:left w:type="dxa" w:w="70"/>
-              <w:bottom w:type="dxa" w:w="25"/>
-              <w:right w:type="dxa" w:w="70"/>
-            </w:tcMar>
-          </w:tcPr>
-          <w:p>
-            <w:pPr>
-              <w:keepNext/>
-              <w:keepLines/>
-              <w:spacing w:after="0" w:before="0" w:line="276"/>
-            </w:pPr>
-            <w:r>
-              <w:rPr>
-                <w:rFonts w:ascii="맑은 고딕" w:cs="맑은 고딕" w:eastAsia="맑은 고딕" w:hAnsi="맑은 고딕"/>
-                <w:b w:val="false"/>
-                <w:bCs w:val="false"/>
-                <w:i w:val="false"/>
-                <w:iCs w:val="false"/>
-                <w:sz w:val="20"/>
-                <w:szCs w:val="20"/>
-              </w:rPr>
-              <w:t xml:space="preserve">⑪ 알고 있는 기능 없음</w:t>
-            </w:r>
-          </w:p>
-        </w:tc>
-        <w:tc>
-          <w:tcPr>
-            <w:tcW w:type="dxa" w:w="3214"/>
-            <w:tcBorders>
-              <w:top w:val="none" w:color="FFFFFF" w:sz="0"/>
-              <w:left w:val="none" w:color="FFFFFF" w:sz="0"/>
-              <w:bottom w:val="none" w:color="FFFFFF" w:sz="0"/>
-              <w:right w:val="none" w:color="FFFFFF" w:sz="0"/>
-            </w:tcBorders>
-            <w:tcMar>
-              <w:top w:type="dxa" w:w="25"/>
-              <w:left w:type="dxa" w:w="70"/>
-              <w:bottom w:type="dxa" w:w="25"/>
-              <w:right w:type="dxa" w:w="70"/>
-            </w:tcMar>
-          </w:tcPr>
-          <w:p>
-            <w:pPr>
-              <w:keepNext/>
-              <w:keepLines/>
-              <w:spacing w:after="0" w:before="0" w:line="276"/>
-            </w:pPr>
-            <w:r>
-              <w:rPr>
-                <w:rFonts w:ascii="맑은 고딕" w:cs="맑은 고딕" w:eastAsia="맑은 고딕" w:hAnsi="맑은 고딕"/>
-                <w:b w:val="false"/>
-                <w:bCs w:val="false"/>
-                <w:i w:val="false"/>
-                <w:iCs w:val="false"/>
-                <w:sz w:val="20"/>
-                <w:szCs w:val="20"/>
-              </w:rPr>
-              <w:t xml:space="preserve"/>
+            <w:tcW w:type="dxa" w:w="4820"/>
+            <w:tcBorders>
+              <w:top w:val="none" w:color="FFFFFF" w:sz="0"/>
+              <w:left w:val="none" w:color="FFFFFF" w:sz="0"/>
+              <w:bottom w:val="none" w:color="FFFFFF" w:sz="0"/>
+              <w:right w:val="none" w:color="FFFFFF" w:sz="0"/>
+            </w:tcBorders>
+            <w:tcMar>
+              <w:top w:type="dxa" w:w="25"/>
+              <w:left w:type="dxa" w:w="70"/>
+              <w:bottom w:type="dxa" w:w="25"/>
+              <w:right w:type="dxa" w:w="70"/>
+            </w:tcMar>
+          </w:tcPr>
+          <w:p>
+            <w:pPr>
+              <w:keepNext/>
+              <w:keepLines/>
+              <w:spacing w:after="0" w:before="0" w:line="276"/>
+            </w:pPr>
+            <w:r>
+              <w:rPr>
+                <w:rFonts w:ascii="맑은 고딕" w:cs="맑은 고딕" w:eastAsia="맑은 고딕" w:hAnsi="맑은 고딕"/>
+                <w:b w:val="false"/>
+                <w:bCs w:val="false"/>
+                <w:i w:val="false"/>
+                <w:iCs w:val="false"/>
+                <w:sz w:val="20"/>
+                <w:szCs w:val="20"/>
+              </w:rPr>
+              <w:t xml:space="preserve">⑦ 정부보조금·생활정보 안내</w:t>
+            </w:r>
+          </w:p>
+        </w:tc>
+        <w:tc>
+          <w:tcPr>
+            <w:tcW w:type="dxa" w:w="4820"/>
+            <w:tcBorders>
+              <w:top w:val="none" w:color="FFFFFF" w:sz="0"/>
+              <w:left w:val="none" w:color="FFFFFF" w:sz="0"/>
+              <w:bottom w:val="none" w:color="FFFFFF" w:sz="0"/>
+              <w:right w:val="none" w:color="FFFFFF" w:sz="0"/>
+            </w:tcBorders>
+            <w:tcMar>
+              <w:top w:type="dxa" w:w="25"/>
+              <w:left w:type="dxa" w:w="70"/>
+              <w:bottom w:type="dxa" w:w="25"/>
+              <w:right w:type="dxa" w:w="70"/>
+            </w:tcMar>
+          </w:tcPr>
+          <w:p>
+            <w:pPr>
+              <w:keepNext/>
+              <w:keepLines/>
+              <w:spacing w:after="0" w:before="0" w:line="276"/>
+            </w:pPr>
+            <w:r>
+              <w:rPr>
+                <w:rFonts w:ascii="맑은 고딕" w:cs="맑은 고딕" w:eastAsia="맑은 고딕" w:hAnsi="맑은 고딕"/>
+                <w:b w:val="false"/>
+                <w:bCs w:val="false"/>
+                <w:i w:val="false"/>
+                <w:iCs w:val="false"/>
+                <w:sz w:val="20"/>
+                <w:szCs w:val="20"/>
+              </w:rPr>
+              <w:t xml:space="preserve">⑧ 청년 전용 적금·대출(청년미래적금 등)</w:t>
+            </w:r>
+          </w:p>
+        </w:tc>
+      </w:tr>
+      <w:tr>
+        <w:trPr>
+          <w:cantSplit/>
+        </w:trPr>
+        <w:tc>
+          <w:tcPr>
+            <w:tcW w:type="dxa" w:w="4820"/>
+            <w:tcBorders>
+              <w:top w:val="none" w:color="FFFFFF" w:sz="0"/>
+              <w:left w:val="none" w:color="FFFFFF" w:sz="0"/>
+              <w:bottom w:val="none" w:color="FFFFFF" w:sz="0"/>
+              <w:right w:val="none" w:color="FFFFFF" w:sz="0"/>
+            </w:tcBorders>
+            <w:tcMar>
+              <w:top w:type="dxa" w:w="25"/>
+              <w:left w:type="dxa" w:w="70"/>
+              <w:bottom w:type="dxa" w:w="25"/>
+              <w:right w:type="dxa" w:w="70"/>
+            </w:tcMar>
+          </w:tcPr>
+          <w:p>
+            <w:pPr>
+              <w:keepNext/>
+              <w:keepLines/>
+              <w:spacing w:after="0" w:before="0" w:line="276"/>
+            </w:pPr>
+            <w:r>
+              <w:rPr>
+                <w:rFonts w:ascii="맑은 고딕" w:cs="맑은 고딕" w:eastAsia="맑은 고딕" w:hAnsi="맑은 고딕"/>
+                <w:b w:val="false"/>
+                <w:bCs w:val="false"/>
+                <w:i w:val="false"/>
+                <w:iCs w:val="false"/>
+                <w:sz w:val="20"/>
+                <w:szCs w:val="20"/>
+              </w:rPr>
+              <w:t xml:space="preserve">⑨ 동백전(부산 지역화폐) 카드 신청·충전 연계</w:t>
+            </w:r>
+          </w:p>
+        </w:tc>
+        <w:tc>
+          <w:tcPr>
+            <w:tcW w:type="dxa" w:w="4820"/>
+            <w:tcBorders>
+              <w:top w:val="none" w:color="FFFFFF" w:sz="0"/>
+              <w:left w:val="none" w:color="FFFFFF" w:sz="0"/>
+              <w:bottom w:val="none" w:color="FFFFFF" w:sz="0"/>
+              <w:right w:val="none" w:color="FFFFFF" w:sz="0"/>
+            </w:tcBorders>
+            <w:tcMar>
+              <w:top w:type="dxa" w:w="25"/>
+              <w:left w:type="dxa" w:w="70"/>
+              <w:bottom w:type="dxa" w:w="25"/>
+              <w:right w:type="dxa" w:w="70"/>
+            </w:tcMar>
+          </w:tcPr>
+          <w:p>
+            <w:pPr>
+              <w:keepNext/>
+              <w:keepLines/>
+              <w:spacing w:after="0" w:before="0" w:line="276"/>
+            </w:pPr>
+            <w:r>
+              <w:rPr>
+                <w:rFonts w:ascii="맑은 고딕" w:cs="맑은 고딕" w:eastAsia="맑은 고딕" w:hAnsi="맑은 고딕"/>
+                <w:b w:val="false"/>
+                <w:bCs w:val="false"/>
+                <w:i w:val="false"/>
+                <w:iCs w:val="false"/>
+                <w:sz w:val="20"/>
+                <w:szCs w:val="20"/>
+              </w:rPr>
+              <w:t xml:space="preserve">⑩ 챗봇 상품 추천·로보어드바이저 펀드</w:t>
+            </w:r>
+          </w:p>
+        </w:tc>
+      </w:tr>
+      <w:tr>
+        <w:trPr>
+          <w:cantSplit/>
+        </w:trPr>
+        <w:tc>
+          <w:tcPr>
+            <w:tcW w:type="dxa" w:w="4820"/>
+            <w:tcBorders>
+              <w:top w:val="none" w:color="FFFFFF" w:sz="0"/>
+              <w:left w:val="none" w:color="FFFFFF" w:sz="0"/>
+              <w:bottom w:val="none" w:color="FFFFFF" w:sz="0"/>
+              <w:right w:val="none" w:color="FFFFFF" w:sz="0"/>
+            </w:tcBorders>
+            <w:tcMar>
+              <w:top w:type="dxa" w:w="25"/>
+              <w:left w:type="dxa" w:w="70"/>
+              <w:bottom w:type="dxa" w:w="25"/>
+              <w:right w:type="dxa" w:w="70"/>
+            </w:tcMar>
+          </w:tcPr>
+          <w:p>
+            <w:pPr>
+              <w:keepNext/>
+              <w:keepLines/>
+              <w:spacing w:after="0" w:before="0" w:line="276"/>
+            </w:pPr>
+            <w:r>
+              <w:rPr>
+                <w:rFonts w:ascii="맑은 고딕" w:cs="맑은 고딕" w:eastAsia="맑은 고딕" w:hAnsi="맑은 고딕"/>
+                <w:b w:val="false"/>
+                <w:bCs w:val="false"/>
+                <w:i w:val="false"/>
+                <w:iCs w:val="false"/>
+                <w:sz w:val="20"/>
+                <w:szCs w:val="20"/>
+              </w:rPr>
+              <w:t xml:space="preserve">⑪ 기타(          )</w:t>
+            </w:r>
+          </w:p>
+        </w:tc>
+        <w:tc>
+          <w:tcPr>
+            <w:tcW w:type="dxa" w:w="4820"/>
+            <w:tcBorders>
+              <w:top w:val="none" w:color="FFFFFF" w:sz="0"/>
+              <w:left w:val="none" w:color="FFFFFF" w:sz="0"/>
+              <w:bottom w:val="none" w:color="FFFFFF" w:sz="0"/>
+              <w:right w:val="none" w:color="FFFFFF" w:sz="0"/>
+            </w:tcBorders>
+            <w:tcMar>
+              <w:top w:type="dxa" w:w="25"/>
+              <w:left w:type="dxa" w:w="70"/>
+              <w:bottom w:type="dxa" w:w="25"/>
+              <w:right w:type="dxa" w:w="70"/>
+            </w:tcMar>
+          </w:tcPr>
+          <w:p>
+            <w:pPr>
+              <w:keepNext/>
+              <w:keepLines/>
+              <w:spacing w:after="0" w:before="0" w:line="276"/>
+            </w:pPr>
+            <w:r>
+              <w:rPr>
+                <w:rFonts w:ascii="맑은 고딕" w:cs="맑은 고딕" w:eastAsia="맑은 고딕" w:hAnsi="맑은 고딕"/>
+                <w:b w:val="false"/>
+                <w:bCs w:val="false"/>
+                <w:i w:val="false"/>
+                <w:iCs w:val="false"/>
+                <w:sz w:val="20"/>
+                <w:szCs w:val="20"/>
+              </w:rPr>
+              <w:t xml:space="preserve">⑫ 알고 있는 기능 없음</w:t>
             </w:r>
           </w:p>
         </w:tc>
@@ -14777,9 +14786,8 @@
         </w:tblBorders>
       </w:tblPr>
       <w:tblGrid>
-        <w:gridCol w:w="3213"/>
-        <w:gridCol w:w="3213"/>
-        <w:gridCol w:w="3214"/>
+        <w:gridCol w:w="4820"/>
+        <w:gridCol w:w="4820"/>
       </w:tblGrid>
       <w:tr>
         <w:trPr>
@@ -14787,43 +14795,43 @@
         </w:trPr>
         <w:tc>
           <w:tcPr>
-            <w:tcW w:type="dxa" w:w="3213"/>
-            <w:tcBorders>
-              <w:top w:val="none" w:color="FFFFFF" w:sz="0"/>
-              <w:left w:val="none" w:color="FFFFFF" w:sz="0"/>
-              <w:bottom w:val="none" w:color="FFFFFF" w:sz="0"/>
-              <w:right w:val="none" w:color="FFFFFF" w:sz="0"/>
-            </w:tcBorders>
-            <w:tcMar>
-              <w:top w:type="dxa" w:w="25"/>
-              <w:left w:type="dxa" w:w="70"/>
-              <w:bottom w:type="dxa" w:w="25"/>
-              <w:right w:type="dxa" w:w="70"/>
-            </w:tcMar>
-          </w:tcPr>
-          <w:p>
-            <w:pPr>
-              <w:keepNext/>
-              <w:keepLines/>
-              <w:spacing w:after="0" w:before="0" w:line="276"/>
-            </w:pPr>
-            <w:r>
-              <w:rPr>
-                <w:rFonts w:ascii="맑은 고딕" w:cs="맑은 고딕" w:eastAsia="맑은 고딕" w:hAnsi="맑은 고딕"/>
-                <w:b w:val="false"/>
-                <w:bCs w:val="false"/>
-                <w:i w:val="false"/>
-                <w:iCs w:val="false"/>
-                <w:sz w:val="20"/>
-                <w:szCs w:val="20"/>
-              </w:rPr>
-              <w:t xml:space="preserve">① 계좌·잔액 조회</w:t>
-            </w:r>
-          </w:p>
-        </w:tc>
-        <w:tc>
-          <w:tcPr>
-            <w:tcW w:type="dxa" w:w="3213"/>
+            <w:tcW w:type="dxa" w:w="4820"/>
+            <w:tcBorders>
+              <w:top w:val="none" w:color="FFFFFF" w:sz="0"/>
+              <w:left w:val="none" w:color="FFFFFF" w:sz="0"/>
+              <w:bottom w:val="none" w:color="FFFFFF" w:sz="0"/>
+              <w:right w:val="none" w:color="FFFFFF" w:sz="0"/>
+            </w:tcBorders>
+            <w:tcMar>
+              <w:top w:type="dxa" w:w="25"/>
+              <w:left w:type="dxa" w:w="70"/>
+              <w:bottom w:type="dxa" w:w="25"/>
+              <w:right w:type="dxa" w:w="70"/>
+            </w:tcMar>
+          </w:tcPr>
+          <w:p>
+            <w:pPr>
+              <w:keepNext/>
+              <w:keepLines/>
+              <w:spacing w:after="0" w:before="0" w:line="276"/>
+            </w:pPr>
+            <w:r>
+              <w:rPr>
+                <w:rFonts w:ascii="맑은 고딕" w:cs="맑은 고딕" w:eastAsia="맑은 고딕" w:hAnsi="맑은 고딕"/>
+                <w:b w:val="false"/>
+                <w:bCs w:val="false"/>
+                <w:i w:val="false"/>
+                <w:iCs w:val="false"/>
+                <w:sz w:val="20"/>
+                <w:szCs w:val="20"/>
+              </w:rPr>
+              <w:t xml:space="preserve">① 계좌·잔액·거래내역 조회</w:t>
+            </w:r>
+          </w:p>
+        </w:tc>
+        <w:tc>
+          <w:tcPr>
+            <w:tcW w:type="dxa" w:w="4820"/>
             <w:tcBorders>
               <w:top w:val="none" w:color="FFFFFF" w:sz="0"/>
               <w:left w:val="none" w:color="FFFFFF" w:sz="0"/>
@@ -14854,42 +14862,6 @@
                 <w:szCs w:val="20"/>
               </w:rPr>
               <w:t xml:space="preserve">② 이체·송금</w:t>
-            </w:r>
-          </w:p>
-        </w:tc>
-        <w:tc>
-          <w:tcPr>
-            <w:tcW w:type="dxa" w:w="3214"/>
-            <w:tcBorders>
-              <w:top w:val="none" w:color="FFFFFF" w:sz="0"/>
-              <w:left w:val="none" w:color="FFFFFF" w:sz="0"/>
-              <w:bottom w:val="none" w:color="FFFFFF" w:sz="0"/>
-              <w:right w:val="none" w:color="FFFFFF" w:sz="0"/>
-            </w:tcBorders>
-            <w:tcMar>
-              <w:top w:type="dxa" w:w="25"/>
-              <w:left w:type="dxa" w:w="70"/>
-              <w:bottom w:type="dxa" w:w="25"/>
-              <w:right w:type="dxa" w:w="70"/>
-            </w:tcMar>
-          </w:tcPr>
-          <w:p>
-            <w:pPr>
-              <w:keepNext/>
-              <w:keepLines/>
-              <w:spacing w:after="0" w:before="0" w:line="276"/>
-            </w:pPr>
-            <w:r>
-              <w:rPr>
-                <w:rFonts w:ascii="맑은 고딕" w:cs="맑은 고딕" w:eastAsia="맑은 고딕" w:hAnsi="맑은 고딕"/>
-                <w:b w:val="false"/>
-                <w:bCs w:val="false"/>
-                <w:i w:val="false"/>
-                <w:iCs w:val="false"/>
-                <w:sz w:val="20"/>
-                <w:szCs w:val="20"/>
-              </w:rPr>
-              <w:t xml:space="preserve">③ 결제·공과금·지방세 납부</w:t>
             </w:r>
           </w:p>
         </w:tc>
@@ -14900,7 +14872,43 @@
         </w:trPr>
         <w:tc>
           <w:tcPr>
-            <w:tcW w:type="dxa" w:w="3213"/>
+            <w:tcW w:type="dxa" w:w="4820"/>
+            <w:tcBorders>
+              <w:top w:val="none" w:color="FFFFFF" w:sz="0"/>
+              <w:left w:val="none" w:color="FFFFFF" w:sz="0"/>
+              <w:bottom w:val="none" w:color="FFFFFF" w:sz="0"/>
+              <w:right w:val="none" w:color="FFFFFF" w:sz="0"/>
+            </w:tcBorders>
+            <w:tcMar>
+              <w:top w:type="dxa" w:w="25"/>
+              <w:left w:type="dxa" w:w="70"/>
+              <w:bottom w:type="dxa" w:w="25"/>
+              <w:right w:type="dxa" w:w="70"/>
+            </w:tcMar>
+          </w:tcPr>
+          <w:p>
+            <w:pPr>
+              <w:keepNext/>
+              <w:keepLines/>
+              <w:spacing w:after="0" w:before="0" w:line="276"/>
+            </w:pPr>
+            <w:r>
+              <w:rPr>
+                <w:rFonts w:ascii="맑은 고딕" w:cs="맑은 고딕" w:eastAsia="맑은 고딕" w:hAnsi="맑은 고딕"/>
+                <w:b w:val="false"/>
+                <w:bCs w:val="false"/>
+                <w:i w:val="false"/>
+                <w:iCs w:val="false"/>
+                <w:sz w:val="20"/>
+                <w:szCs w:val="20"/>
+              </w:rPr>
+              <w:t xml:space="preserve">③ 공과금·지방세 납부</w:t>
+            </w:r>
+          </w:p>
+        </w:tc>
+        <w:tc>
+          <w:tcPr>
+            <w:tcW w:type="dxa" w:w="4820"/>
             <w:tcBorders>
               <w:top w:val="none" w:color="FFFFFF" w:sz="0"/>
               <w:left w:val="none" w:color="FFFFFF" w:sz="0"/>
@@ -14931,78 +14939,6 @@
                 <w:szCs w:val="20"/>
               </w:rPr>
               <w:t xml:space="preserve">④ 예금·적금 가입·관리</w:t>
-            </w:r>
-          </w:p>
-        </w:tc>
-        <w:tc>
-          <w:tcPr>
-            <w:tcW w:type="dxa" w:w="3213"/>
-            <w:tcBorders>
-              <w:top w:val="none" w:color="FFFFFF" w:sz="0"/>
-              <w:left w:val="none" w:color="FFFFFF" w:sz="0"/>
-              <w:bottom w:val="none" w:color="FFFFFF" w:sz="0"/>
-              <w:right w:val="none" w:color="FFFFFF" w:sz="0"/>
-            </w:tcBorders>
-            <w:tcMar>
-              <w:top w:type="dxa" w:w="25"/>
-              <w:left w:type="dxa" w:w="70"/>
-              <w:bottom w:type="dxa" w:w="25"/>
-              <w:right w:type="dxa" w:w="70"/>
-            </w:tcMar>
-          </w:tcPr>
-          <w:p>
-            <w:pPr>
-              <w:keepNext/>
-              <w:keepLines/>
-              <w:spacing w:after="0" w:before="0" w:line="276"/>
-            </w:pPr>
-            <w:r>
-              <w:rPr>
-                <w:rFonts w:ascii="맑은 고딕" w:cs="맑은 고딕" w:eastAsia="맑은 고딕" w:hAnsi="맑은 고딕"/>
-                <w:b w:val="false"/>
-                <w:bCs w:val="false"/>
-                <w:i w:val="false"/>
-                <w:iCs w:val="false"/>
-                <w:sz w:val="20"/>
-                <w:szCs w:val="20"/>
-              </w:rPr>
-              <w:t xml:space="preserve">⑤ 대출 조회·신청·상환</w:t>
-            </w:r>
-          </w:p>
-        </w:tc>
-        <w:tc>
-          <w:tcPr>
-            <w:tcW w:type="dxa" w:w="3214"/>
-            <w:tcBorders>
-              <w:top w:val="none" w:color="FFFFFF" w:sz="0"/>
-              <w:left w:val="none" w:color="FFFFFF" w:sz="0"/>
-              <w:bottom w:val="none" w:color="FFFFFF" w:sz="0"/>
-              <w:right w:val="none" w:color="FFFFFF" w:sz="0"/>
-            </w:tcBorders>
-            <w:tcMar>
-              <w:top w:type="dxa" w:w="25"/>
-              <w:left w:type="dxa" w:w="70"/>
-              <w:bottom w:type="dxa" w:w="25"/>
-              <w:right w:type="dxa" w:w="70"/>
-            </w:tcMar>
-          </w:tcPr>
-          <w:p>
-            <w:pPr>
-              <w:keepNext/>
-              <w:keepLines/>
-              <w:spacing w:after="0" w:before="0" w:line="276"/>
-            </w:pPr>
-            <w:r>
-              <w:rPr>
-                <w:rFonts w:ascii="맑은 고딕" w:cs="맑은 고딕" w:eastAsia="맑은 고딕" w:hAnsi="맑은 고딕"/>
-                <w:b w:val="false"/>
-                <w:bCs w:val="false"/>
-                <w:i w:val="false"/>
-                <w:iCs w:val="false"/>
-                <w:sz w:val="20"/>
-                <w:szCs w:val="20"/>
-              </w:rPr>
-              <w:t xml:space="preserve">⑥ 환전·외화</w:t>
             </w:r>
           </w:p>
         </w:tc>
@@ -15013,109 +14949,73 @@
         </w:trPr>
         <w:tc>
           <w:tcPr>
-            <w:tcW w:type="dxa" w:w="3213"/>
-            <w:tcBorders>
-              <w:top w:val="none" w:color="FFFFFF" w:sz="0"/>
-              <w:left w:val="none" w:color="FFFFFF" w:sz="0"/>
-              <w:bottom w:val="none" w:color="FFFFFF" w:sz="0"/>
-              <w:right w:val="none" w:color="FFFFFF" w:sz="0"/>
-            </w:tcBorders>
-            <w:tcMar>
-              <w:top w:type="dxa" w:w="25"/>
-              <w:left w:type="dxa" w:w="70"/>
-              <w:bottom w:type="dxa" w:w="25"/>
-              <w:right w:type="dxa" w:w="70"/>
-            </w:tcMar>
-          </w:tcPr>
-          <w:p>
-            <w:pPr>
-              <w:keepNext/>
-              <w:keepLines/>
-              <w:spacing w:after="0" w:before="0" w:line="276"/>
-            </w:pPr>
-            <w:r>
-              <w:rPr>
-                <w:rFonts w:ascii="맑은 고딕" w:cs="맑은 고딕" w:eastAsia="맑은 고딕" w:hAnsi="맑은 고딕"/>
-                <w:b w:val="false"/>
-                <w:bCs w:val="false"/>
-                <w:i w:val="false"/>
-                <w:iCs w:val="false"/>
-                <w:sz w:val="20"/>
-                <w:szCs w:val="20"/>
-              </w:rPr>
-              <w:t xml:space="preserve">⑦ 제휴 할인·적립·이벤트</w:t>
-            </w:r>
-          </w:p>
-        </w:tc>
-        <w:tc>
-          <w:tcPr>
-            <w:tcW w:type="dxa" w:w="3213"/>
-            <w:tcBorders>
-              <w:top w:val="none" w:color="FFFFFF" w:sz="0"/>
-              <w:left w:val="none" w:color="FFFFFF" w:sz="0"/>
-              <w:bottom w:val="none" w:color="FFFFFF" w:sz="0"/>
-              <w:right w:val="none" w:color="FFFFFF" w:sz="0"/>
-            </w:tcBorders>
-            <w:tcMar>
-              <w:top w:type="dxa" w:w="25"/>
-              <w:left w:type="dxa" w:w="70"/>
-              <w:bottom w:type="dxa" w:w="25"/>
-              <w:right w:type="dxa" w:w="70"/>
-            </w:tcMar>
-          </w:tcPr>
-          <w:p>
-            <w:pPr>
-              <w:keepNext/>
-              <w:keepLines/>
-              <w:spacing w:after="0" w:before="0" w:line="276"/>
-            </w:pPr>
-            <w:r>
-              <w:rPr>
-                <w:rFonts w:ascii="맑은 고딕" w:cs="맑은 고딕" w:eastAsia="맑은 고딕" w:hAnsi="맑은 고딕"/>
-                <w:b w:val="false"/>
-                <w:bCs w:val="false"/>
-                <w:i w:val="false"/>
-                <w:iCs w:val="false"/>
-                <w:sz w:val="20"/>
-                <w:szCs w:val="20"/>
-              </w:rPr>
-              <w:t xml:space="preserve">⑧ 동백전·지역 혜택 연계</w:t>
-            </w:r>
-          </w:p>
-        </w:tc>
-        <w:tc>
-          <w:tcPr>
-            <w:tcW w:type="dxa" w:w="3214"/>
-            <w:tcBorders>
-              <w:top w:val="none" w:color="FFFFFF" w:sz="0"/>
-              <w:left w:val="none" w:color="FFFFFF" w:sz="0"/>
-              <w:bottom w:val="none" w:color="FFFFFF" w:sz="0"/>
-              <w:right w:val="none" w:color="FFFFFF" w:sz="0"/>
-            </w:tcBorders>
-            <w:tcMar>
-              <w:top w:type="dxa" w:w="25"/>
-              <w:left w:type="dxa" w:w="70"/>
-              <w:bottom w:type="dxa" w:w="25"/>
-              <w:right w:type="dxa" w:w="70"/>
-            </w:tcMar>
-          </w:tcPr>
-          <w:p>
-            <w:pPr>
-              <w:keepNext/>
-              <w:keepLines/>
-              <w:spacing w:after="0" w:before="0" w:line="276"/>
-            </w:pPr>
-            <w:r>
-              <w:rPr>
-                <w:rFonts w:ascii="맑은 고딕" w:cs="맑은 고딕" w:eastAsia="맑은 고딕" w:hAnsi="맑은 고딕"/>
-                <w:b w:val="false"/>
-                <w:bCs w:val="false"/>
-                <w:i w:val="false"/>
-                <w:iCs w:val="false"/>
-                <w:sz w:val="20"/>
-                <w:szCs w:val="20"/>
-              </w:rPr>
-              <w:t xml:space="preserve">⑨ 자산관리·소비내역 확인</w:t>
+            <w:tcW w:type="dxa" w:w="4820"/>
+            <w:tcBorders>
+              <w:top w:val="none" w:color="FFFFFF" w:sz="0"/>
+              <w:left w:val="none" w:color="FFFFFF" w:sz="0"/>
+              <w:bottom w:val="none" w:color="FFFFFF" w:sz="0"/>
+              <w:right w:val="none" w:color="FFFFFF" w:sz="0"/>
+            </w:tcBorders>
+            <w:tcMar>
+              <w:top w:type="dxa" w:w="25"/>
+              <w:left w:type="dxa" w:w="70"/>
+              <w:bottom w:type="dxa" w:w="25"/>
+              <w:right w:type="dxa" w:w="70"/>
+            </w:tcMar>
+          </w:tcPr>
+          <w:p>
+            <w:pPr>
+              <w:keepNext/>
+              <w:keepLines/>
+              <w:spacing w:after="0" w:before="0" w:line="276"/>
+            </w:pPr>
+            <w:r>
+              <w:rPr>
+                <w:rFonts w:ascii="맑은 고딕" w:cs="맑은 고딕" w:eastAsia="맑은 고딕" w:hAnsi="맑은 고딕"/>
+                <w:b w:val="false"/>
+                <w:bCs w:val="false"/>
+                <w:i w:val="false"/>
+                <w:iCs w:val="false"/>
+                <w:sz w:val="20"/>
+                <w:szCs w:val="20"/>
+              </w:rPr>
+              <w:t xml:space="preserve">⑤ 대출 조회·신청·상환</w:t>
+            </w:r>
+          </w:p>
+        </w:tc>
+        <w:tc>
+          <w:tcPr>
+            <w:tcW w:type="dxa" w:w="4820"/>
+            <w:tcBorders>
+              <w:top w:val="none" w:color="FFFFFF" w:sz="0"/>
+              <w:left w:val="none" w:color="FFFFFF" w:sz="0"/>
+              <w:bottom w:val="none" w:color="FFFFFF" w:sz="0"/>
+              <w:right w:val="none" w:color="FFFFFF" w:sz="0"/>
+            </w:tcBorders>
+            <w:tcMar>
+              <w:top w:type="dxa" w:w="25"/>
+              <w:left w:type="dxa" w:w="70"/>
+              <w:bottom w:type="dxa" w:w="25"/>
+              <w:right w:type="dxa" w:w="70"/>
+            </w:tcMar>
+          </w:tcPr>
+          <w:p>
+            <w:pPr>
+              <w:keepNext/>
+              <w:keepLines/>
+              <w:spacing w:after="0" w:before="0" w:line="276"/>
+            </w:pPr>
+            <w:r>
+              <w:rPr>
+                <w:rFonts w:ascii="맑은 고딕" w:cs="맑은 고딕" w:eastAsia="맑은 고딕" w:hAnsi="맑은 고딕"/>
+                <w:b w:val="false"/>
+                <w:bCs w:val="false"/>
+                <w:i w:val="false"/>
+                <w:iCs w:val="false"/>
+                <w:sz w:val="20"/>
+                <w:szCs w:val="20"/>
+              </w:rPr>
+              <w:t xml:space="preserve">⑥ 환전·외화</w:t>
             </w:r>
           </w:p>
         </w:tc>
@@ -15126,109 +15026,227 @@
         </w:trPr>
         <w:tc>
           <w:tcPr>
-            <w:tcW w:type="dxa" w:w="3213"/>
-            <w:tcBorders>
-              <w:top w:val="none" w:color="FFFFFF" w:sz="0"/>
-              <w:left w:val="none" w:color="FFFFFF" w:sz="0"/>
-              <w:bottom w:val="none" w:color="FFFFFF" w:sz="0"/>
-              <w:right w:val="none" w:color="FFFFFF" w:sz="0"/>
-            </w:tcBorders>
-            <w:tcMar>
-              <w:top w:type="dxa" w:w="25"/>
-              <w:left w:type="dxa" w:w="70"/>
-              <w:bottom w:type="dxa" w:w="25"/>
-              <w:right w:type="dxa" w:w="70"/>
-            </w:tcMar>
-          </w:tcPr>
-          <w:p>
-            <w:pPr>
-              <w:keepNext/>
-              <w:keepLines/>
-              <w:spacing w:after="0" w:before="0" w:line="276"/>
-            </w:pPr>
-            <w:r>
-              <w:rPr>
-                <w:rFonts w:ascii="맑은 고딕" w:cs="맑은 고딕" w:eastAsia="맑은 고딕" w:hAnsi="맑은 고딕"/>
-                <w:b w:val="false"/>
-                <w:bCs w:val="false"/>
-                <w:i w:val="false"/>
-                <w:iCs w:val="false"/>
-                <w:sz w:val="20"/>
-                <w:szCs w:val="20"/>
-              </w:rPr>
-              <w:t xml:space="preserve">⑩ 알림·안내 확인</w:t>
-            </w:r>
-          </w:p>
-        </w:tc>
-        <w:tc>
-          <w:tcPr>
-            <w:tcW w:type="dxa" w:w="3213"/>
-            <w:tcBorders>
-              <w:top w:val="none" w:color="FFFFFF" w:sz="0"/>
-              <w:left w:val="none" w:color="FFFFFF" w:sz="0"/>
-              <w:bottom w:val="none" w:color="FFFFFF" w:sz="0"/>
-              <w:right w:val="none" w:color="FFFFFF" w:sz="0"/>
-            </w:tcBorders>
-            <w:tcMar>
-              <w:top w:type="dxa" w:w="25"/>
-              <w:left w:type="dxa" w:w="70"/>
-              <w:bottom w:type="dxa" w:w="25"/>
-              <w:right w:type="dxa" w:w="70"/>
-            </w:tcMar>
-          </w:tcPr>
-          <w:p>
-            <w:pPr>
-              <w:keepNext/>
-              <w:keepLines/>
-              <w:spacing w:after="0" w:before="0" w:line="276"/>
-            </w:pPr>
-            <w:r>
-              <w:rPr>
-                <w:rFonts w:ascii="맑은 고딕" w:cs="맑은 고딕" w:eastAsia="맑은 고딕" w:hAnsi="맑은 고딕"/>
-                <w:b w:val="false"/>
-                <w:bCs w:val="false"/>
-                <w:i w:val="false"/>
-                <w:iCs w:val="false"/>
-                <w:sz w:val="20"/>
-                <w:szCs w:val="20"/>
-              </w:rPr>
-              <w:t xml:space="preserve">⑪ 기타(          )</w:t>
-            </w:r>
-          </w:p>
-        </w:tc>
-        <w:tc>
-          <w:tcPr>
-            <w:tcW w:type="dxa" w:w="3214"/>
-            <w:tcBorders>
-              <w:top w:val="none" w:color="FFFFFF" w:sz="0"/>
-              <w:left w:val="none" w:color="FFFFFF" w:sz="0"/>
-              <w:bottom w:val="none" w:color="FFFFFF" w:sz="0"/>
-              <w:right w:val="none" w:color="FFFFFF" w:sz="0"/>
-            </w:tcBorders>
-            <w:tcMar>
-              <w:top w:type="dxa" w:w="25"/>
-              <w:left w:type="dxa" w:w="70"/>
-              <w:bottom w:type="dxa" w:w="25"/>
-              <w:right w:type="dxa" w:w="70"/>
-            </w:tcMar>
-          </w:tcPr>
-          <w:p>
-            <w:pPr>
-              <w:keepNext/>
-              <w:keepLines/>
-              <w:spacing w:after="0" w:before="0" w:line="276"/>
-            </w:pPr>
-            <w:r>
-              <w:rPr>
-                <w:rFonts w:ascii="맑은 고딕" w:cs="맑은 고딕" w:eastAsia="맑은 고딕" w:hAnsi="맑은 고딕"/>
-                <w:b w:val="false"/>
-                <w:bCs w:val="false"/>
-                <w:i w:val="false"/>
-                <w:iCs w:val="false"/>
-                <w:sz w:val="20"/>
-                <w:szCs w:val="20"/>
-              </w:rPr>
-              <w:t xml:space="preserve"/>
+            <w:tcW w:type="dxa" w:w="4820"/>
+            <w:tcBorders>
+              <w:top w:val="none" w:color="FFFFFF" w:sz="0"/>
+              <w:left w:val="none" w:color="FFFFFF" w:sz="0"/>
+              <w:bottom w:val="none" w:color="FFFFFF" w:sz="0"/>
+              <w:right w:val="none" w:color="FFFFFF" w:sz="0"/>
+            </w:tcBorders>
+            <w:tcMar>
+              <w:top w:type="dxa" w:w="25"/>
+              <w:left w:type="dxa" w:w="70"/>
+              <w:bottom w:type="dxa" w:w="25"/>
+              <w:right w:type="dxa" w:w="70"/>
+            </w:tcMar>
+          </w:tcPr>
+          <w:p>
+            <w:pPr>
+              <w:keepNext/>
+              <w:keepLines/>
+              <w:spacing w:after="0" w:before="0" w:line="276"/>
+            </w:pPr>
+            <w:r>
+              <w:rPr>
+                <w:rFonts w:ascii="맑은 고딕" w:cs="맑은 고딕" w:eastAsia="맑은 고딕" w:hAnsi="맑은 고딕"/>
+                <w:b w:val="false"/>
+                <w:bCs w:val="false"/>
+                <w:i w:val="false"/>
+                <w:iCs w:val="false"/>
+                <w:sz w:val="20"/>
+                <w:szCs w:val="20"/>
+              </w:rPr>
+              <w:t xml:space="preserve">⑦ 라이프 생활서비스(공연·영화·맛집·여행·스낵365)</w:t>
+            </w:r>
+          </w:p>
+        </w:tc>
+        <w:tc>
+          <w:tcPr>
+            <w:tcW w:type="dxa" w:w="4820"/>
+            <w:tcBorders>
+              <w:top w:val="none" w:color="FFFFFF" w:sz="0"/>
+              <w:left w:val="none" w:color="FFFFFF" w:sz="0"/>
+              <w:bottom w:val="none" w:color="FFFFFF" w:sz="0"/>
+              <w:right w:val="none" w:color="FFFFFF" w:sz="0"/>
+            </w:tcBorders>
+            <w:tcMar>
+              <w:top w:type="dxa" w:w="25"/>
+              <w:left w:type="dxa" w:w="70"/>
+              <w:bottom w:type="dxa" w:w="25"/>
+              <w:right w:type="dxa" w:w="70"/>
+            </w:tcMar>
+          </w:tcPr>
+          <w:p>
+            <w:pPr>
+              <w:keepNext/>
+              <w:keepLines/>
+              <w:spacing w:after="0" w:before="0" w:line="276"/>
+            </w:pPr>
+            <w:r>
+              <w:rPr>
+                <w:rFonts w:ascii="맑은 고딕" w:cs="맑은 고딕" w:eastAsia="맑은 고딕" w:hAnsi="맑은 고딕"/>
+                <w:b w:val="false"/>
+                <w:bCs w:val="false"/>
+                <w:i w:val="false"/>
+                <w:iCs w:val="false"/>
+                <w:sz w:val="20"/>
+                <w:szCs w:val="20"/>
+              </w:rPr>
+              <w:t xml:space="preserve">⑧ 이벤트·혜택 응모</w:t>
+            </w:r>
+          </w:p>
+        </w:tc>
+      </w:tr>
+      <w:tr>
+        <w:trPr>
+          <w:cantSplit/>
+        </w:trPr>
+        <w:tc>
+          <w:tcPr>
+            <w:tcW w:type="dxa" w:w="4820"/>
+            <w:tcBorders>
+              <w:top w:val="none" w:color="FFFFFF" w:sz="0"/>
+              <w:left w:val="none" w:color="FFFFFF" w:sz="0"/>
+              <w:bottom w:val="none" w:color="FFFFFF" w:sz="0"/>
+              <w:right w:val="none" w:color="FFFFFF" w:sz="0"/>
+            </w:tcBorders>
+            <w:tcMar>
+              <w:top w:type="dxa" w:w="25"/>
+              <w:left w:type="dxa" w:w="70"/>
+              <w:bottom w:type="dxa" w:w="25"/>
+              <w:right w:type="dxa" w:w="70"/>
+            </w:tcMar>
+          </w:tcPr>
+          <w:p>
+            <w:pPr>
+              <w:keepNext/>
+              <w:keepLines/>
+              <w:spacing w:after="0" w:before="0" w:line="276"/>
+            </w:pPr>
+            <w:r>
+              <w:rPr>
+                <w:rFonts w:ascii="맑은 고딕" w:cs="맑은 고딕" w:eastAsia="맑은 고딕" w:hAnsi="맑은 고딕"/>
+                <w:b w:val="false"/>
+                <w:bCs w:val="false"/>
+                <w:i w:val="false"/>
+                <w:iCs w:val="false"/>
+                <w:sz w:val="20"/>
+                <w:szCs w:val="20"/>
+              </w:rPr>
+              <w:t xml:space="preserve">⑨ 마이페이지 자산·금융일정 확인</w:t>
+            </w:r>
+          </w:p>
+        </w:tc>
+        <w:tc>
+          <w:tcPr>
+            <w:tcW w:type="dxa" w:w="4820"/>
+            <w:tcBorders>
+              <w:top w:val="none" w:color="FFFFFF" w:sz="0"/>
+              <w:left w:val="none" w:color="FFFFFF" w:sz="0"/>
+              <w:bottom w:val="none" w:color="FFFFFF" w:sz="0"/>
+              <w:right w:val="none" w:color="FFFFFF" w:sz="0"/>
+            </w:tcBorders>
+            <w:tcMar>
+              <w:top w:type="dxa" w:w="25"/>
+              <w:left w:type="dxa" w:w="70"/>
+              <w:bottom w:type="dxa" w:w="25"/>
+              <w:right w:type="dxa" w:w="70"/>
+            </w:tcMar>
+          </w:tcPr>
+          <w:p>
+            <w:pPr>
+              <w:keepNext/>
+              <w:keepLines/>
+              <w:spacing w:after="0" w:before="0" w:line="276"/>
+            </w:pPr>
+            <w:r>
+              <w:rPr>
+                <w:rFonts w:ascii="맑은 고딕" w:cs="맑은 고딕" w:eastAsia="맑은 고딕" w:hAnsi="맑은 고딕"/>
+                <w:b w:val="false"/>
+                <w:bCs w:val="false"/>
+                <w:i w:val="false"/>
+                <w:iCs w:val="false"/>
+                <w:sz w:val="20"/>
+                <w:szCs w:val="20"/>
+              </w:rPr>
+              <w:t xml:space="preserve">⑩ 동백전 카드·충전 연계</w:t>
+            </w:r>
+          </w:p>
+        </w:tc>
+      </w:tr>
+      <w:tr>
+        <w:trPr>
+          <w:cantSplit/>
+        </w:trPr>
+        <w:tc>
+          <w:tcPr>
+            <w:tcW w:type="dxa" w:w="4820"/>
+            <w:tcBorders>
+              <w:top w:val="none" w:color="FFFFFF" w:sz="0"/>
+              <w:left w:val="none" w:color="FFFFFF" w:sz="0"/>
+              <w:bottom w:val="none" w:color="FFFFFF" w:sz="0"/>
+              <w:right w:val="none" w:color="FFFFFF" w:sz="0"/>
+            </w:tcBorders>
+            <w:tcMar>
+              <w:top w:type="dxa" w:w="25"/>
+              <w:left w:type="dxa" w:w="70"/>
+              <w:bottom w:type="dxa" w:w="25"/>
+              <w:right w:type="dxa" w:w="70"/>
+            </w:tcMar>
+          </w:tcPr>
+          <w:p>
+            <w:pPr>
+              <w:keepNext/>
+              <w:keepLines/>
+              <w:spacing w:after="0" w:before="0" w:line="276"/>
+            </w:pPr>
+            <w:r>
+              <w:rPr>
+                <w:rFonts w:ascii="맑은 고딕" w:cs="맑은 고딕" w:eastAsia="맑은 고딕" w:hAnsi="맑은 고딕"/>
+                <w:b w:val="false"/>
+                <w:bCs w:val="false"/>
+                <w:i w:val="false"/>
+                <w:iCs w:val="false"/>
+                <w:sz w:val="20"/>
+                <w:szCs w:val="20"/>
+              </w:rPr>
+              <w:t xml:space="preserve">⑪ 푸시알림·안내 확인</w:t>
+            </w:r>
+          </w:p>
+        </w:tc>
+        <w:tc>
+          <w:tcPr>
+            <w:tcW w:type="dxa" w:w="4820"/>
+            <w:tcBorders>
+              <w:top w:val="none" w:color="FFFFFF" w:sz="0"/>
+              <w:left w:val="none" w:color="FFFFFF" w:sz="0"/>
+              <w:bottom w:val="none" w:color="FFFFFF" w:sz="0"/>
+              <w:right w:val="none" w:color="FFFFFF" w:sz="0"/>
+            </w:tcBorders>
+            <w:tcMar>
+              <w:top w:type="dxa" w:w="25"/>
+              <w:left w:type="dxa" w:w="70"/>
+              <w:bottom w:type="dxa" w:w="25"/>
+              <w:right w:type="dxa" w:w="70"/>
+            </w:tcMar>
+          </w:tcPr>
+          <w:p>
+            <w:pPr>
+              <w:keepNext/>
+              <w:keepLines/>
+              <w:spacing w:after="0" w:before="0" w:line="276"/>
+            </w:pPr>
+            <w:r>
+              <w:rPr>
+                <w:rFonts w:ascii="맑은 고딕" w:cs="맑은 고딕" w:eastAsia="맑은 고딕" w:hAnsi="맑은 고딕"/>
+                <w:b w:val="false"/>
+                <w:bCs w:val="false"/>
+                <w:i w:val="false"/>
+                <w:iCs w:val="false"/>
+                <w:sz w:val="20"/>
+                <w:szCs w:val="20"/>
+              </w:rPr>
+              <w:t xml:space="preserve">⑫ 기타(          )</w:t>
             </w:r>
           </w:p>
         </w:tc>
@@ -18903,7 +18921,7 @@
           <w:sz w:val="20"/>
           <w:szCs w:val="20"/>
         </w:rPr>
-        <w:t xml:space="preserve">부산은행 계좌 관련 업무(조회·이체 등)를 부산은행 앱이 아닌 다른 앱(토스·카카오뱅크·카카오페이 등)으로 처리한 경험에 가장 가까운 보기 하나만 선택해 주세요.</w:t>
+        <w:t xml:space="preserve">부산은행 계좌 관련 업무(조회·이체·결제 등)를 처리할 때 주로 이용하는 경로를 순서대로 2가지 골라 번호를 적어 주세요(부산은행 계좌가 없으면 1순위에 ⑧을 적어 주세요).</w:t>
       </w:r>
     </w:p>
     <w:tbl>
@@ -18919,9 +18937,8 @@
         </w:tblBorders>
       </w:tblPr>
       <w:tblGrid>
-        <w:gridCol w:w="3213"/>
-        <w:gridCol w:w="3213"/>
-        <w:gridCol w:w="3214"/>
+        <w:gridCol w:w="4820"/>
+        <w:gridCol w:w="4820"/>
       </w:tblGrid>
       <w:tr>
         <w:trPr>
@@ -18929,109 +18946,73 @@
         </w:trPr>
         <w:tc>
           <w:tcPr>
-            <w:tcW w:type="dxa" w:w="3213"/>
-            <w:tcBorders>
-              <w:top w:val="none" w:color="FFFFFF" w:sz="0"/>
-              <w:left w:val="none" w:color="FFFFFF" w:sz="0"/>
-              <w:bottom w:val="none" w:color="FFFFFF" w:sz="0"/>
-              <w:right w:val="none" w:color="FFFFFF" w:sz="0"/>
-            </w:tcBorders>
-            <w:tcMar>
-              <w:top w:type="dxa" w:w="25"/>
-              <w:left w:type="dxa" w:w="70"/>
-              <w:bottom w:type="dxa" w:w="25"/>
-              <w:right w:type="dxa" w:w="70"/>
-            </w:tcMar>
-          </w:tcPr>
-          <w:p>
-            <w:pPr>
-              <w:keepNext/>
-              <w:keepLines/>
-              <w:spacing w:after="0" w:before="0" w:line="276"/>
-            </w:pPr>
-            <w:r>
-              <w:rPr>
-                <w:rFonts w:ascii="맑은 고딕" w:cs="맑은 고딕" w:eastAsia="맑은 고딕" w:hAnsi="맑은 고딕"/>
-                <w:b w:val="false"/>
-                <w:bCs w:val="false"/>
-                <w:i w:val="false"/>
-                <w:iCs w:val="false"/>
-                <w:sz w:val="20"/>
-                <w:szCs w:val="20"/>
-              </w:rPr>
-              <w:t xml:space="preserve">① 대부분 다른 앱으로 처리함</w:t>
-            </w:r>
-          </w:p>
-        </w:tc>
-        <w:tc>
-          <w:tcPr>
-            <w:tcW w:type="dxa" w:w="3213"/>
-            <w:tcBorders>
-              <w:top w:val="none" w:color="FFFFFF" w:sz="0"/>
-              <w:left w:val="none" w:color="FFFFFF" w:sz="0"/>
-              <w:bottom w:val="none" w:color="FFFFFF" w:sz="0"/>
-              <w:right w:val="none" w:color="FFFFFF" w:sz="0"/>
-            </w:tcBorders>
-            <w:tcMar>
-              <w:top w:type="dxa" w:w="25"/>
-              <w:left w:type="dxa" w:w="70"/>
-              <w:bottom w:type="dxa" w:w="25"/>
-              <w:right w:type="dxa" w:w="70"/>
-            </w:tcMar>
-          </w:tcPr>
-          <w:p>
-            <w:pPr>
-              <w:keepNext/>
-              <w:keepLines/>
-              <w:spacing w:after="0" w:before="0" w:line="276"/>
-            </w:pPr>
-            <w:r>
-              <w:rPr>
-                <w:rFonts w:ascii="맑은 고딕" w:cs="맑은 고딕" w:eastAsia="맑은 고딕" w:hAnsi="맑은 고딕"/>
-                <w:b w:val="false"/>
-                <w:bCs w:val="false"/>
-                <w:i w:val="false"/>
-                <w:iCs w:val="false"/>
-                <w:sz w:val="20"/>
-                <w:szCs w:val="20"/>
-              </w:rPr>
-              <w:t xml:space="preserve">② 절반 정도 다른 앱으로 처리함</w:t>
-            </w:r>
-          </w:p>
-        </w:tc>
-        <w:tc>
-          <w:tcPr>
-            <w:tcW w:type="dxa" w:w="3214"/>
-            <w:tcBorders>
-              <w:top w:val="none" w:color="FFFFFF" w:sz="0"/>
-              <w:left w:val="none" w:color="FFFFFF" w:sz="0"/>
-              <w:bottom w:val="none" w:color="FFFFFF" w:sz="0"/>
-              <w:right w:val="none" w:color="FFFFFF" w:sz="0"/>
-            </w:tcBorders>
-            <w:tcMar>
-              <w:top w:type="dxa" w:w="25"/>
-              <w:left w:type="dxa" w:w="70"/>
-              <w:bottom w:type="dxa" w:w="25"/>
-              <w:right w:type="dxa" w:w="70"/>
-            </w:tcMar>
-          </w:tcPr>
-          <w:p>
-            <w:pPr>
-              <w:keepNext/>
-              <w:keepLines/>
-              <w:spacing w:after="0" w:before="0" w:line="276"/>
-            </w:pPr>
-            <w:r>
-              <w:rPr>
-                <w:rFonts w:ascii="맑은 고딕" w:cs="맑은 고딕" w:eastAsia="맑은 고딕" w:hAnsi="맑은 고딕"/>
-                <w:b w:val="false"/>
-                <w:bCs w:val="false"/>
-                <w:i w:val="false"/>
-                <w:iCs w:val="false"/>
-                <w:sz w:val="20"/>
-                <w:szCs w:val="20"/>
-              </w:rPr>
-              <w:t xml:space="preserve">③ 가끔 다른 앱으로 처리함</w:t>
+            <w:tcW w:type="dxa" w:w="4820"/>
+            <w:tcBorders>
+              <w:top w:val="none" w:color="FFFFFF" w:sz="0"/>
+              <w:left w:val="none" w:color="FFFFFF" w:sz="0"/>
+              <w:bottom w:val="none" w:color="FFFFFF" w:sz="0"/>
+              <w:right w:val="none" w:color="FFFFFF" w:sz="0"/>
+            </w:tcBorders>
+            <w:tcMar>
+              <w:top w:type="dxa" w:w="25"/>
+              <w:left w:type="dxa" w:w="70"/>
+              <w:bottom w:type="dxa" w:w="25"/>
+              <w:right w:type="dxa" w:w="70"/>
+            </w:tcMar>
+          </w:tcPr>
+          <w:p>
+            <w:pPr>
+              <w:keepNext/>
+              <w:keepLines/>
+              <w:spacing w:after="0" w:before="0" w:line="276"/>
+            </w:pPr>
+            <w:r>
+              <w:rPr>
+                <w:rFonts w:ascii="맑은 고딕" w:cs="맑은 고딕" w:eastAsia="맑은 고딕" w:hAnsi="맑은 고딕"/>
+                <w:b w:val="false"/>
+                <w:bCs w:val="false"/>
+                <w:i w:val="false"/>
+                <w:iCs w:val="false"/>
+                <w:sz w:val="20"/>
+                <w:szCs w:val="20"/>
+              </w:rPr>
+              <w:t xml:space="preserve">① 부산은행 모바일뱅킹 앱</w:t>
+            </w:r>
+          </w:p>
+        </w:tc>
+        <w:tc>
+          <w:tcPr>
+            <w:tcW w:type="dxa" w:w="4820"/>
+            <w:tcBorders>
+              <w:top w:val="none" w:color="FFFFFF" w:sz="0"/>
+              <w:left w:val="none" w:color="FFFFFF" w:sz="0"/>
+              <w:bottom w:val="none" w:color="FFFFFF" w:sz="0"/>
+              <w:right w:val="none" w:color="FFFFFF" w:sz="0"/>
+            </w:tcBorders>
+            <w:tcMar>
+              <w:top w:type="dxa" w:w="25"/>
+              <w:left w:type="dxa" w:w="70"/>
+              <w:bottom w:type="dxa" w:w="25"/>
+              <w:right w:type="dxa" w:w="70"/>
+            </w:tcMar>
+          </w:tcPr>
+          <w:p>
+            <w:pPr>
+              <w:keepNext/>
+              <w:keepLines/>
+              <w:spacing w:after="0" w:before="0" w:line="276"/>
+            </w:pPr>
+            <w:r>
+              <w:rPr>
+                <w:rFonts w:ascii="맑은 고딕" w:cs="맑은 고딕" w:eastAsia="맑은 고딕" w:hAnsi="맑은 고딕"/>
+                <w:b w:val="false"/>
+                <w:bCs w:val="false"/>
+                <w:i w:val="false"/>
+                <w:iCs w:val="false"/>
+                <w:sz w:val="20"/>
+                <w:szCs w:val="20"/>
+              </w:rPr>
+              <w:t xml:space="preserve">② 부산은행 인터넷뱅킹(PC)</w:t>
             </w:r>
           </w:p>
         </w:tc>
@@ -19042,114 +19023,300 @@
         </w:trPr>
         <w:tc>
           <w:tcPr>
-            <w:tcW w:type="dxa" w:w="3213"/>
-            <w:tcBorders>
-              <w:top w:val="none" w:color="FFFFFF" w:sz="0"/>
-              <w:left w:val="none" w:color="FFFFFF" w:sz="0"/>
-              <w:bottom w:val="none" w:color="FFFFFF" w:sz="0"/>
-              <w:right w:val="none" w:color="FFFFFF" w:sz="0"/>
-            </w:tcBorders>
-            <w:tcMar>
-              <w:top w:type="dxa" w:w="25"/>
-              <w:left w:type="dxa" w:w="70"/>
-              <w:bottom w:type="dxa" w:w="25"/>
-              <w:right w:type="dxa" w:w="70"/>
-            </w:tcMar>
-          </w:tcPr>
-          <w:p>
-            <w:pPr>
-              <w:keepNext/>
-              <w:keepLines/>
-              <w:spacing w:after="0" w:before="0" w:line="276"/>
-            </w:pPr>
-            <w:r>
-              <w:rPr>
-                <w:rFonts w:ascii="맑은 고딕" w:cs="맑은 고딕" w:eastAsia="맑은 고딕" w:hAnsi="맑은 고딕"/>
-                <w:b w:val="false"/>
-                <w:bCs w:val="false"/>
-                <w:i w:val="false"/>
-                <w:iCs w:val="false"/>
-                <w:sz w:val="20"/>
-                <w:szCs w:val="20"/>
-              </w:rPr>
-              <w:t xml:space="preserve">④ 항상 부산은행 앱으로 처리함</w:t>
-            </w:r>
-          </w:p>
-        </w:tc>
-        <w:tc>
-          <w:tcPr>
-            <w:tcW w:type="dxa" w:w="3213"/>
-            <w:tcBorders>
-              <w:top w:val="none" w:color="FFFFFF" w:sz="0"/>
-              <w:left w:val="none" w:color="FFFFFF" w:sz="0"/>
-              <w:bottom w:val="none" w:color="FFFFFF" w:sz="0"/>
-              <w:right w:val="none" w:color="FFFFFF" w:sz="0"/>
-            </w:tcBorders>
-            <w:tcMar>
-              <w:top w:type="dxa" w:w="25"/>
-              <w:left w:type="dxa" w:w="70"/>
-              <w:bottom w:type="dxa" w:w="25"/>
-              <w:right w:type="dxa" w:w="70"/>
-            </w:tcMar>
-          </w:tcPr>
-          <w:p>
-            <w:pPr>
-              <w:keepNext/>
-              <w:keepLines/>
-              <w:spacing w:after="0" w:before="0" w:line="276"/>
-            </w:pPr>
-            <w:r>
-              <w:rPr>
-                <w:rFonts w:ascii="맑은 고딕" w:cs="맑은 고딕" w:eastAsia="맑은 고딕" w:hAnsi="맑은 고딕"/>
-                <w:b w:val="false"/>
-                <w:bCs w:val="false"/>
-                <w:i w:val="false"/>
-                <w:iCs w:val="false"/>
-                <w:sz w:val="20"/>
-                <w:szCs w:val="20"/>
-              </w:rPr>
-              <w:t xml:space="preserve">⑤ 부산은행 계좌가 없음</w:t>
-            </w:r>
-          </w:p>
-        </w:tc>
-        <w:tc>
-          <w:tcPr>
-            <w:tcW w:type="dxa" w:w="3214"/>
-            <w:tcBorders>
-              <w:top w:val="none" w:color="FFFFFF" w:sz="0"/>
-              <w:left w:val="none" w:color="FFFFFF" w:sz="0"/>
-              <w:bottom w:val="none" w:color="FFFFFF" w:sz="0"/>
-              <w:right w:val="none" w:color="FFFFFF" w:sz="0"/>
-            </w:tcBorders>
-            <w:tcMar>
-              <w:top w:type="dxa" w:w="25"/>
-              <w:left w:type="dxa" w:w="70"/>
-              <w:bottom w:type="dxa" w:w="25"/>
-              <w:right w:type="dxa" w:w="70"/>
-            </w:tcMar>
-          </w:tcPr>
-          <w:p>
-            <w:pPr>
-              <w:keepNext/>
-              <w:keepLines/>
-              <w:spacing w:after="0" w:before="0" w:line="276"/>
-            </w:pPr>
-            <w:r>
-              <w:rPr>
-                <w:rFonts w:ascii="맑은 고딕" w:cs="맑은 고딕" w:eastAsia="맑은 고딕" w:hAnsi="맑은 고딕"/>
-                <w:b w:val="false"/>
-                <w:bCs w:val="false"/>
-                <w:i w:val="false"/>
-                <w:iCs w:val="false"/>
-                <w:sz w:val="20"/>
-                <w:szCs w:val="20"/>
-              </w:rPr>
-              <w:t xml:space="preserve">⑥ 잘 모르겠음</w:t>
+            <w:tcW w:type="dxa" w:w="4820"/>
+            <w:tcBorders>
+              <w:top w:val="none" w:color="FFFFFF" w:sz="0"/>
+              <w:left w:val="none" w:color="FFFFFF" w:sz="0"/>
+              <w:bottom w:val="none" w:color="FFFFFF" w:sz="0"/>
+              <w:right w:val="none" w:color="FFFFFF" w:sz="0"/>
+            </w:tcBorders>
+            <w:tcMar>
+              <w:top w:type="dxa" w:w="25"/>
+              <w:left w:type="dxa" w:w="70"/>
+              <w:bottom w:type="dxa" w:w="25"/>
+              <w:right w:type="dxa" w:w="70"/>
+            </w:tcMar>
+          </w:tcPr>
+          <w:p>
+            <w:pPr>
+              <w:keepNext/>
+              <w:keepLines/>
+              <w:spacing w:after="0" w:before="0" w:line="276"/>
+            </w:pPr>
+            <w:r>
+              <w:rPr>
+                <w:rFonts w:ascii="맑은 고딕" w:cs="맑은 고딕" w:eastAsia="맑은 고딕" w:hAnsi="맑은 고딕"/>
+                <w:b w:val="false"/>
+                <w:bCs w:val="false"/>
+                <w:i w:val="false"/>
+                <w:iCs w:val="false"/>
+                <w:sz w:val="20"/>
+                <w:szCs w:val="20"/>
+              </w:rPr>
+              <w:t xml:space="preserve">③ 부산은행 영업점 창구</w:t>
+            </w:r>
+          </w:p>
+        </w:tc>
+        <w:tc>
+          <w:tcPr>
+            <w:tcW w:type="dxa" w:w="4820"/>
+            <w:tcBorders>
+              <w:top w:val="none" w:color="FFFFFF" w:sz="0"/>
+              <w:left w:val="none" w:color="FFFFFF" w:sz="0"/>
+              <w:bottom w:val="none" w:color="FFFFFF" w:sz="0"/>
+              <w:right w:val="none" w:color="FFFFFF" w:sz="0"/>
+            </w:tcBorders>
+            <w:tcMar>
+              <w:top w:type="dxa" w:w="25"/>
+              <w:left w:type="dxa" w:w="70"/>
+              <w:bottom w:type="dxa" w:w="25"/>
+              <w:right w:type="dxa" w:w="70"/>
+            </w:tcMar>
+          </w:tcPr>
+          <w:p>
+            <w:pPr>
+              <w:keepNext/>
+              <w:keepLines/>
+              <w:spacing w:after="0" w:before="0" w:line="276"/>
+            </w:pPr>
+            <w:r>
+              <w:rPr>
+                <w:rFonts w:ascii="맑은 고딕" w:cs="맑은 고딕" w:eastAsia="맑은 고딕" w:hAnsi="맑은 고딕"/>
+                <w:b w:val="false"/>
+                <w:bCs w:val="false"/>
+                <w:i w:val="false"/>
+                <w:iCs w:val="false"/>
+                <w:sz w:val="20"/>
+                <w:szCs w:val="20"/>
+              </w:rPr>
+              <w:t xml:space="preserve">④ 부산은행 ATM</w:t>
+            </w:r>
+          </w:p>
+        </w:tc>
+      </w:tr>
+      <w:tr>
+        <w:trPr>
+          <w:cantSplit/>
+        </w:trPr>
+        <w:tc>
+          <w:tcPr>
+            <w:tcW w:type="dxa" w:w="4820"/>
+            <w:tcBorders>
+              <w:top w:val="none" w:color="FFFFFF" w:sz="0"/>
+              <w:left w:val="none" w:color="FFFFFF" w:sz="0"/>
+              <w:bottom w:val="none" w:color="FFFFFF" w:sz="0"/>
+              <w:right w:val="none" w:color="FFFFFF" w:sz="0"/>
+            </w:tcBorders>
+            <w:tcMar>
+              <w:top w:type="dxa" w:w="25"/>
+              <w:left w:type="dxa" w:w="70"/>
+              <w:bottom w:type="dxa" w:w="25"/>
+              <w:right w:type="dxa" w:w="70"/>
+            </w:tcMar>
+          </w:tcPr>
+          <w:p>
+            <w:pPr>
+              <w:keepNext/>
+              <w:keepLines/>
+              <w:spacing w:after="0" w:before="0" w:line="276"/>
+            </w:pPr>
+            <w:r>
+              <w:rPr>
+                <w:rFonts w:ascii="맑은 고딕" w:cs="맑은 고딕" w:eastAsia="맑은 고딕" w:hAnsi="맑은 고딕"/>
+                <w:b w:val="false"/>
+                <w:bCs w:val="false"/>
+                <w:i w:val="false"/>
+                <w:iCs w:val="false"/>
+                <w:sz w:val="20"/>
+                <w:szCs w:val="20"/>
+              </w:rPr>
+              <w:t xml:space="preserve">⑤ 토스·카카오뱅크 등 다른 금융 앱(오픈뱅킹)</w:t>
+            </w:r>
+          </w:p>
+        </w:tc>
+        <w:tc>
+          <w:tcPr>
+            <w:tcW w:type="dxa" w:w="4820"/>
+            <w:tcBorders>
+              <w:top w:val="none" w:color="FFFFFF" w:sz="0"/>
+              <w:left w:val="none" w:color="FFFFFF" w:sz="0"/>
+              <w:bottom w:val="none" w:color="FFFFFF" w:sz="0"/>
+              <w:right w:val="none" w:color="FFFFFF" w:sz="0"/>
+            </w:tcBorders>
+            <w:tcMar>
+              <w:top w:type="dxa" w:w="25"/>
+              <w:left w:type="dxa" w:w="70"/>
+              <w:bottom w:type="dxa" w:w="25"/>
+              <w:right w:type="dxa" w:w="70"/>
+            </w:tcMar>
+          </w:tcPr>
+          <w:p>
+            <w:pPr>
+              <w:keepNext/>
+              <w:keepLines/>
+              <w:spacing w:after="0" w:before="0" w:line="276"/>
+            </w:pPr>
+            <w:r>
+              <w:rPr>
+                <w:rFonts w:ascii="맑은 고딕" w:cs="맑은 고딕" w:eastAsia="맑은 고딕" w:hAnsi="맑은 고딕"/>
+                <w:b w:val="false"/>
+                <w:bCs w:val="false"/>
+                <w:i w:val="false"/>
+                <w:iCs w:val="false"/>
+                <w:sz w:val="20"/>
+                <w:szCs w:val="20"/>
+              </w:rPr>
+              <w:t xml:space="preserve">⑥ 카카오페이·네이버페이 등 간편결제 앱</w:t>
+            </w:r>
+          </w:p>
+        </w:tc>
+      </w:tr>
+      <w:tr>
+        <w:trPr>
+          <w:cantSplit/>
+        </w:trPr>
+        <w:tc>
+          <w:tcPr>
+            <w:tcW w:type="dxa" w:w="4820"/>
+            <w:tcBorders>
+              <w:top w:val="none" w:color="FFFFFF" w:sz="0"/>
+              <w:left w:val="none" w:color="FFFFFF" w:sz="0"/>
+              <w:bottom w:val="none" w:color="FFFFFF" w:sz="0"/>
+              <w:right w:val="none" w:color="FFFFFF" w:sz="0"/>
+            </w:tcBorders>
+            <w:tcMar>
+              <w:top w:type="dxa" w:w="25"/>
+              <w:left w:type="dxa" w:w="70"/>
+              <w:bottom w:type="dxa" w:w="25"/>
+              <w:right w:type="dxa" w:w="70"/>
+            </w:tcMar>
+          </w:tcPr>
+          <w:p>
+            <w:pPr>
+              <w:keepNext/>
+              <w:keepLines/>
+              <w:spacing w:after="0" w:before="0" w:line="276"/>
+            </w:pPr>
+            <w:r>
+              <w:rPr>
+                <w:rFonts w:ascii="맑은 고딕" w:cs="맑은 고딕" w:eastAsia="맑은 고딕" w:hAnsi="맑은 고딕"/>
+                <w:b w:val="false"/>
+                <w:bCs w:val="false"/>
+                <w:i w:val="false"/>
+                <w:iCs w:val="false"/>
+                <w:sz w:val="20"/>
+                <w:szCs w:val="20"/>
+              </w:rPr>
+              <w:t xml:space="preserve">⑦ 기타(          )</w:t>
+            </w:r>
+          </w:p>
+        </w:tc>
+        <w:tc>
+          <w:tcPr>
+            <w:tcW w:type="dxa" w:w="4820"/>
+            <w:tcBorders>
+              <w:top w:val="none" w:color="FFFFFF" w:sz="0"/>
+              <w:left w:val="none" w:color="FFFFFF" w:sz="0"/>
+              <w:bottom w:val="none" w:color="FFFFFF" w:sz="0"/>
+              <w:right w:val="none" w:color="FFFFFF" w:sz="0"/>
+            </w:tcBorders>
+            <w:tcMar>
+              <w:top w:type="dxa" w:w="25"/>
+              <w:left w:type="dxa" w:w="70"/>
+              <w:bottom w:type="dxa" w:w="25"/>
+              <w:right w:type="dxa" w:w="70"/>
+            </w:tcMar>
+          </w:tcPr>
+          <w:p>
+            <w:pPr>
+              <w:keepNext/>
+              <w:keepLines/>
+              <w:spacing w:after="0" w:before="0" w:line="276"/>
+            </w:pPr>
+            <w:r>
+              <w:rPr>
+                <w:rFonts w:ascii="맑은 고딕" w:cs="맑은 고딕" w:eastAsia="맑은 고딕" w:hAnsi="맑은 고딕"/>
+                <w:b w:val="false"/>
+                <w:bCs w:val="false"/>
+                <w:i w:val="false"/>
+                <w:iCs w:val="false"/>
+                <w:sz w:val="20"/>
+                <w:szCs w:val="20"/>
+              </w:rPr>
+              <w:t xml:space="preserve">⑧ 부산은행 계좌 없음</w:t>
             </w:r>
           </w:p>
         </w:tc>
       </w:tr>
     </w:tbl>
+    <w:p>
+      <w:pPr>
+        <w:keepNext w:val="false"/>
+        <w:keepLines/>
+        <w:spacing w:after="120" w:before="60" w:line="276"/>
+        <w:ind w:left="300"/>
+      </w:pPr>
+      <w:r>
+        <w:rPr>
+          <w:rFonts w:ascii="맑은 고딕" w:cs="맑은 고딕" w:eastAsia="맑은 고딕" w:hAnsi="맑은 고딕"/>
+          <w:b/>
+          <w:bCs/>
+          <w:i w:val="false"/>
+          <w:iCs w:val="false"/>
+          <w:sz w:val="20"/>
+          <w:szCs w:val="20"/>
+        </w:rPr>
+        <w:t xml:space="preserve">1순위: </w:t>
+      </w:r>
+      <w:r>
+        <w:rPr>
+          <w:rFonts w:ascii="맑은 고딕" w:cs="맑은 고딕" w:eastAsia="맑은 고딕" w:hAnsi="맑은 고딕"/>
+          <w:b w:val="false"/>
+          <w:bCs w:val="false"/>
+          <w:i w:val="false"/>
+          <w:iCs w:val="false"/>
+          <w:sz w:val="20"/>
+          <w:szCs w:val="20"/>
+        </w:rPr>
+        <w:t xml:space="preserve">________</w:t>
+      </w:r>
+      <w:r>
+        <w:rPr>
+          <w:rFonts w:ascii="맑은 고딕" w:cs="맑은 고딕" w:eastAsia="맑은 고딕" w:hAnsi="맑은 고딕"/>
+          <w:b w:val="false"/>
+          <w:bCs w:val="false"/>
+          <w:i w:val="false"/>
+          <w:iCs w:val="false"/>
+          <w:sz w:val="20"/>
+          <w:szCs w:val="20"/>
+        </w:rPr>
+        <w:t xml:space="preserve">      </w:t>
+      </w:r>
+      <w:r>
+        <w:rPr>
+          <w:rFonts w:ascii="맑은 고딕" w:cs="맑은 고딕" w:eastAsia="맑은 고딕" w:hAnsi="맑은 고딕"/>
+          <w:b/>
+          <w:bCs/>
+          <w:i w:val="false"/>
+          <w:iCs w:val="false"/>
+          <w:sz w:val="20"/>
+          <w:szCs w:val="20"/>
+        </w:rPr>
+        <w:t xml:space="preserve">2순위: </w:t>
+      </w:r>
+      <w:r>
+        <w:rPr>
+          <w:rFonts w:ascii="맑은 고딕" w:cs="맑은 고딕" w:eastAsia="맑은 고딕" w:hAnsi="맑은 고딕"/>
+          <w:b w:val="false"/>
+          <w:bCs w:val="false"/>
+          <w:i w:val="false"/>
+          <w:iCs w:val="false"/>
+          <w:sz w:val="20"/>
+          <w:szCs w:val="20"/>
+        </w:rPr>
+        <w:t xml:space="preserve">________</w:t>
+      </w:r>
+    </w:p>
     <w:p>
       <w:pPr>
         <w:keepNext/>
@@ -24517,7 +24684,7 @@
           <w:sz w:val="20"/>
           <w:szCs w:val="20"/>
         </w:rPr>
-        <w:t xml:space="preserve">부산은행 모바일뱅킹에 생긴다면 이용하고 싶은 부산 지역 연계 서비스를 순서대로 3가지 골라 번호를 적어 주세요.</w:t>
+        <w:t xml:space="preserve">현재 제공 여부와 관계없이 부산은행 모바일뱅킹에서 이용하고 싶은 부산 지역 연계·생활 서비스를 순서대로 3가지 골라 번호를 적어 주세요.</w:t>
       </w:r>
     </w:p>
     <w:tbl>
@@ -24608,7 +24775,7 @@
                 <w:sz w:val="20"/>
                 <w:szCs w:val="20"/>
               </w:rPr>
-              <w:t xml:space="preserve">② 동백전(지역화폐)·대중교통·생활요금 연계 결제와 내역 확인</w:t>
+              <w:t xml:space="preserve">② 동백전 충전·결제·캐시백 내역을 앱 안에서 바로 확인</w:t>
             </w:r>
           </w:p>
         </w:tc>
@@ -24685,7 +24852,7 @@
                 <w:sz w:val="20"/>
                 <w:szCs w:val="20"/>
               </w:rPr>
-              <w:t xml:space="preserve">④ 청년·주거·취업·창업 등 지역 금융지원 정보 모아보기</w:t>
+              <w:t xml:space="preserve">④ 청년·주거·취업·창업 등 지역 금융지원과 정부보조금 정보 모아보기</w:t>
             </w:r>
           </w:p>
         </w:tc>
@@ -24803,7 +24970,7 @@
                 <w:sz w:val="20"/>
                 <w:szCs w:val="20"/>
               </w:rPr>
-              <w:t xml:space="preserve">⑦ 대학생 전용 계좌·학자금·장학 정보</w:t>
+              <w:t xml:space="preserve">⑦ 대학생 전용 계좌·학자금·장학 정보와 캠퍼스 연계(모바일 학생증 등)</w:t>
             </w:r>
           </w:p>
         </w:tc>
@@ -24916,7 +25083,7 @@
                 <w:sz w:val="20"/>
                 <w:szCs w:val="20"/>
               </w:rPr>
-              <w:t xml:space="preserve">⑩ 기타(          )</w:t>
+              <w:t xml:space="preserve">⑩ 대중교통(동백패스)·생활요금 연계 결제와 환급 안내</w:t>
             </w:r>
           </w:p>
         </w:tc>
@@ -24957,7 +25124,7 @@
                 <w:sz w:val="20"/>
                 <w:szCs w:val="20"/>
               </w:rPr>
-              <w:t xml:space="preserve">⑪ 필요한 서비스 없음</w:t>
+              <w:t xml:space="preserve">⑪ 기타(          )</w:t>
             </w:r>
           </w:p>
         </w:tc>
@@ -24993,7 +25160,7 @@
                 <w:sz w:val="20"/>
                 <w:szCs w:val="20"/>
               </w:rPr>
-              <w:t xml:space="preserve"/>
+              <w:t xml:space="preserve">⑫ 필요한 서비스 없음</w:t>
             </w:r>
           </w:p>
         </w:tc>

</xml_diff>